<commit_message>
Initial commit of TradeSim monorepo files
</commit_message>
<xml_diff>
--- a/tradesimw2.docx
+++ b/tradesimw2.docx
@@ -34,6 +34,29 @@
     <w:p>
       <w:pPr>
         <w:rPr>
+          <w:lang w:val="en-US"/>
+        </w:rPr>
+      </w:pPr>
+      <w:hyperlink r:id="rId5" w:history="1">
+        <w:r>
+          <w:rPr>
+            <w:rStyle w:val="Hyperlink"/>
+            <w:lang w:val="en-US"/>
+          </w:rPr>
+          <w:t>https://www.trade-flo.com/#:~:text=Tradeflo%20is%20a%20working%20capital,the%20Americas%2C%20Europe%20and%20Asia</w:t>
+        </w:r>
+      </w:hyperlink>
+      <w:r>
+        <w:rPr>
+          <w:lang w:val="en-US"/>
+        </w:rPr>
+        <w:t>.</w:t>
+      </w:r>
+    </w:p>
+    <w:p/>
+    <w:p>
+      <w:pPr>
+        <w:rPr>
           <w:b/>
           <w:bCs/>
         </w:rPr>
@@ -117,7 +140,7 @@
       <w:r>
         <w:t xml:space="preserve"> Removes data from the system (e.g., deleting a post). [</w:t>
       </w:r>
-      <w:hyperlink r:id="rId5" w:history="1">
+      <w:hyperlink r:id="rId6" w:history="1">
         <w:r>
           <w:rPr>
             <w:rStyle w:val="Hyperlink"/>
@@ -128,7 +151,7 @@
       <w:r>
         <w:t xml:space="preserve">, </w:t>
       </w:r>
-      <w:hyperlink r:id="rId6" w:history="1">
+      <w:hyperlink r:id="rId7" w:history="1">
         <w:r>
           <w:rPr>
             <w:rStyle w:val="Hyperlink"/>
@@ -208,7 +231,7 @@
       <w:r>
         <w:t xml:space="preserve"> Forms, content management systems (CMS), and dashboards are designed around these four actions to allow users to interact with data. [</w:t>
       </w:r>
-      <w:hyperlink r:id="rId7" w:history="1">
+      <w:hyperlink r:id="rId8" w:history="1">
         <w:r>
           <w:rPr>
             <w:rStyle w:val="Hyperlink"/>
@@ -219,7 +242,7 @@
       <w:r>
         <w:t xml:space="preserve">, </w:t>
       </w:r>
-      <w:hyperlink r:id="rId8" w:history="1">
+      <w:hyperlink r:id="rId9" w:history="1">
         <w:r>
           <w:rPr>
             <w:rStyle w:val="Hyperlink"/>
@@ -230,7 +253,7 @@
       <w:r>
         <w:t xml:space="preserve">, </w:t>
       </w:r>
-      <w:hyperlink r:id="rId9" w:history="1">
+      <w:hyperlink r:id="rId10" w:history="1">
         <w:r>
           <w:rPr>
             <w:rStyle w:val="Hyperlink"/>
@@ -241,7 +264,7 @@
       <w:r>
         <w:t xml:space="preserve">, </w:t>
       </w:r>
-      <w:hyperlink r:id="rId10" w:history="1">
+      <w:hyperlink r:id="rId11" w:history="1">
         <w:r>
           <w:rPr>
             <w:rStyle w:val="Hyperlink"/>
@@ -252,7 +275,7 @@
       <w:r>
         <w:t xml:space="preserve">, </w:t>
       </w:r>
-      <w:hyperlink r:id="rId11" w:history="1">
+      <w:hyperlink r:id="rId12" w:history="1">
         <w:r>
           <w:rPr>
             <w:rStyle w:val="Hyperlink"/>
@@ -389,7 +412,7 @@
                     </pic:cNvPicPr>
                   </pic:nvPicPr>
                   <pic:blipFill>
-                    <a:blip r:embed="rId12">
+                    <a:blip r:embed="rId13">
                       <a:extLst>
                         <a:ext uri="{28A0092B-C50C-407E-A947-70E740481C1C}">
                           <a14:useLocalDpi xmlns:a14="http://schemas.microsoft.com/office/drawing/2010/main" val="0"/>
@@ -425,7 +448,7 @@
       <w:r>
         <w:t>WebSocket rendering is the process of updating a web page's user interface (UI) in real time by pushing new data or pre-rendered HTML chunks from a server to a client via an open WebSocket connection. It eliminates the need for traditional HTTP page reloads or frequent polling. [</w:t>
       </w:r>
-      <w:hyperlink r:id="rId13" w:history="1">
+      <w:hyperlink r:id="rId14" w:history="1">
         <w:r>
           <w:rPr>
             <w:rStyle w:val="Hyperlink"/>
@@ -436,7 +459,7 @@
       <w:r>
         <w:t xml:space="preserve">, </w:t>
       </w:r>
-      <w:hyperlink r:id="rId14" w:history="1">
+      <w:hyperlink r:id="rId15" w:history="1">
         <w:r>
           <w:rPr>
             <w:rStyle w:val="Hyperlink"/>
@@ -447,7 +470,7 @@
       <w:r>
         <w:t xml:space="preserve">, </w:t>
       </w:r>
-      <w:hyperlink r:id="rId15" w:history="1">
+      <w:hyperlink r:id="rId16" w:history="1">
         <w:r>
           <w:rPr>
             <w:rStyle w:val="Hyperlink"/>
@@ -458,7 +481,7 @@
       <w:r>
         <w:t xml:space="preserve">, </w:t>
       </w:r>
-      <w:hyperlink r:id="rId16" w:history="1">
+      <w:hyperlink r:id="rId17" w:history="1">
         <w:r>
           <w:rPr>
             <w:rStyle w:val="Hyperlink"/>
@@ -469,7 +492,7 @@
       <w:r>
         <w:t xml:space="preserve">, </w:t>
       </w:r>
-      <w:hyperlink r:id="rId17" w:history="1">
+      <w:hyperlink r:id="rId18" w:history="1">
         <w:r>
           <w:rPr>
             <w:rStyle w:val="Hyperlink"/>
@@ -493,7 +516,7 @@
       <w:r>
         <w:t xml:space="preserve"> allow for persistent, two-way communication, they are widely used to handle rendering in modern dynamic applications. [</w:t>
       </w:r>
-      <w:hyperlink r:id="rId18" w:history="1">
+      <w:hyperlink r:id="rId19" w:history="1">
         <w:r>
           <w:rPr>
             <w:rStyle w:val="Hyperlink"/>
@@ -504,7 +527,7 @@
       <w:r>
         <w:t xml:space="preserve">, </w:t>
       </w:r>
-      <w:hyperlink r:id="rId19" w:history="1">
+      <w:hyperlink r:id="rId20" w:history="1">
         <w:r>
           <w:rPr>
             <w:rStyle w:val="Hyperlink"/>
@@ -515,7 +538,7 @@
       <w:r>
         <w:t xml:space="preserve">, </w:t>
       </w:r>
-      <w:hyperlink r:id="rId20" w:history="1">
+      <w:hyperlink r:id="rId21" w:history="1">
         <w:r>
           <w:rPr>
             <w:rStyle w:val="Hyperlink"/>
@@ -526,7 +549,7 @@
       <w:r>
         <w:t xml:space="preserve">, </w:t>
       </w:r>
-      <w:hyperlink r:id="rId21" w:history="1">
+      <w:hyperlink r:id="rId22" w:history="1">
         <w:r>
           <w:rPr>
             <w:rStyle w:val="Hyperlink"/>
@@ -606,7 +629,7 @@
       <w:r>
         <w:t xml:space="preserve"> When the client receives a push event, it executes JavaScript to update the DOM (Document Object Model) with the newly provided data or HTML snippet. [</w:t>
       </w:r>
-      <w:hyperlink r:id="rId22" w:history="1">
+      <w:hyperlink r:id="rId23" w:history="1">
         <w:r>
           <w:rPr>
             <w:rStyle w:val="Hyperlink"/>
@@ -617,7 +640,7 @@
       <w:r>
         <w:t xml:space="preserve">, </w:t>
       </w:r>
-      <w:hyperlink r:id="rId23" w:history="1">
+      <w:hyperlink r:id="rId24" w:history="1">
         <w:r>
           <w:rPr>
             <w:rStyle w:val="Hyperlink"/>
@@ -628,7 +651,7 @@
       <w:r>
         <w:t xml:space="preserve">, </w:t>
       </w:r>
-      <w:hyperlink r:id="rId24" w:history="1">
+      <w:hyperlink r:id="rId25" w:history="1">
         <w:r>
           <w:rPr>
             <w:rStyle w:val="Hyperlink"/>
@@ -744,7 +767,7 @@
       <w:r>
         <w:t xml:space="preserve"> Rendering live scores, time remaining, or bid amounts in real time. [</w:t>
       </w:r>
-      <w:hyperlink r:id="rId25" w:history="1">
+      <w:hyperlink r:id="rId26" w:history="1">
         <w:r>
           <w:rPr>
             <w:rStyle w:val="Hyperlink"/>
@@ -755,7 +778,7 @@
       <w:r>
         <w:t xml:space="preserve">, </w:t>
       </w:r>
-      <w:hyperlink r:id="rId26" w:history="1">
+      <w:hyperlink r:id="rId27" w:history="1">
         <w:r>
           <w:rPr>
             <w:rStyle w:val="Hyperlink"/>
@@ -766,7 +789,7 @@
       <w:r>
         <w:t xml:space="preserve">, </w:t>
       </w:r>
-      <w:hyperlink r:id="rId27" w:history="1">
+      <w:hyperlink r:id="rId28" w:history="1">
         <w:r>
           <w:rPr>
             <w:rStyle w:val="Hyperlink"/>
@@ -846,7 +869,7 @@
       <w:r>
         <w:t xml:space="preserve"> The server controls exactly when to trigger a render, ensuring users see synchronized, fresh data. [</w:t>
       </w:r>
-      <w:hyperlink r:id="rId28" w:history="1">
+      <w:hyperlink r:id="rId29" w:history="1">
         <w:r>
           <w:rPr>
             <w:rStyle w:val="Hyperlink"/>
@@ -857,7 +880,7 @@
       <w:r>
         <w:t xml:space="preserve">, </w:t>
       </w:r>
-      <w:hyperlink r:id="rId29" w:history="1">
+      <w:hyperlink r:id="rId30" w:history="1">
         <w:r>
           <w:rPr>
             <w:rStyle w:val="Hyperlink"/>
@@ -868,7 +891,7 @@
       <w:r>
         <w:t xml:space="preserve">, </w:t>
       </w:r>
-      <w:hyperlink r:id="rId30" w:history="1">
+      <w:hyperlink r:id="rId31" w:history="1">
         <w:r>
           <w:rPr>
             <w:rStyle w:val="Hyperlink"/>
@@ -879,7 +902,7 @@
       <w:r>
         <w:t xml:space="preserve">, </w:t>
       </w:r>
-      <w:hyperlink r:id="rId31" w:history="1">
+      <w:hyperlink r:id="rId32" w:history="1">
         <w:r>
           <w:rPr>
             <w:rStyle w:val="Hyperlink"/>
@@ -890,7 +913,7 @@
       <w:r>
         <w:t xml:space="preserve">, </w:t>
       </w:r>
-      <w:hyperlink r:id="rId32" w:history="1">
+      <w:hyperlink r:id="rId33" w:history="1">
         <w:r>
           <w:rPr>
             <w:rStyle w:val="Hyperlink"/>
@@ -921,7 +944,7 @@
       <w:r>
         <w:t>While powerful, WebSocket rendering is not suitable for static websites or content-heavy blogs. For standard e-commerce or informational sites, traditional Server-Side Rendering (SSR) or Static Site Generation (SSG) is much more efficient, easier to cache, and better for SEO. [</w:t>
       </w:r>
-      <w:hyperlink r:id="rId33" w:history="1">
+      <w:hyperlink r:id="rId34" w:history="1">
         <w:r>
           <w:rPr>
             <w:rStyle w:val="Hyperlink"/>
@@ -932,7 +955,7 @@
       <w:r>
         <w:t xml:space="preserve">, </w:t>
       </w:r>
-      <w:hyperlink r:id="rId34" w:history="1">
+      <w:hyperlink r:id="rId35" w:history="1">
         <w:r>
           <w:rPr>
             <w:rStyle w:val="Hyperlink"/>
@@ -943,7 +966,7 @@
       <w:r>
         <w:t xml:space="preserve">, </w:t>
       </w:r>
-      <w:hyperlink r:id="rId35" w:history="1">
+      <w:hyperlink r:id="rId36" w:history="1">
         <w:r>
           <w:rPr>
             <w:rStyle w:val="Hyperlink"/>
@@ -954,7 +977,7 @@
       <w:r>
         <w:t xml:space="preserve">, </w:t>
       </w:r>
-      <w:hyperlink r:id="rId36" w:history="1">
+      <w:hyperlink r:id="rId37" w:history="1">
         <w:r>
           <w:rPr>
             <w:rStyle w:val="Hyperlink"/>
@@ -965,7 +988,7 @@
       <w:r>
         <w:t xml:space="preserve">, </w:t>
       </w:r>
-      <w:hyperlink r:id="rId37" w:history="1">
+      <w:hyperlink r:id="rId38" w:history="1">
         <w:r>
           <w:rPr>
             <w:rStyle w:val="Hyperlink"/>

</xml_diff>

<commit_message>
feat(web): build mobile-first stock trading experience with review-first execution flow
</commit_message>
<xml_diff>
--- a/tradesimw2.docx
+++ b/tradesimw2.docx
@@ -37,7 +37,7 @@
           <w:lang w:val="en-US"/>
         </w:rPr>
       </w:pPr>
-      <w:hyperlink r:id="rId5" w:history="1">
+      <w:hyperlink r:id="rId5" w:anchor=":~:text=Tradeflo%20is%20a%20working%20capital,the%20Americas%2C%20Europe%20and%20Asia" w:history="1">
         <w:r>
           <w:rPr>
             <w:rStyle w:val="Hyperlink"/>
@@ -393,6 +393,9 @@
     </w:p>
     <w:p>
       <w:r>
+        <w:rPr>
+          <w:noProof/>
+        </w:rPr>
         <w:lastRenderedPageBreak/>
         <w:drawing>
           <wp:inline distT="0" distB="0" distL="0" distR="0" wp14:anchorId="5D63B64B" wp14:editId="3CBB341C">
@@ -1003,6 +1006,135 @@
     <w:p>
       <w:pPr>
         <w:rPr>
+          <w:b/>
+          <w:bCs/>
+        </w:rPr>
+      </w:pPr>
+      <w:r>
+        <w:rPr>
+          <w:b/>
+          <w:bCs/>
+        </w:rPr>
+        <w:lastRenderedPageBreak/>
+        <w:t>3. Market-data dependency risk</w:t>
+      </w:r>
+    </w:p>
+    <w:p>
+      <w:r>
+        <w:t>THIS is probably your biggest real technical/business risk now.</w:t>
+      </w:r>
+    </w:p>
+    <w:p>
+      <w:r>
+        <w:t>Not React.</w:t>
+      </w:r>
+      <w:r>
+        <w:br/>
+        <w:t>Not Redis.</w:t>
+      </w:r>
+      <w:r>
+        <w:br/>
+        <w:t>Not Prisma.</w:t>
+      </w:r>
+    </w:p>
+    <w:p>
+      <w:pPr>
+        <w:rPr>
+          <w:lang w:val="en-US"/>
+        </w:rPr>
+      </w:pPr>
+    </w:p>
+    <w:p>
+      <w:r>
+        <w:t>scaling bottleneck</w:t>
+      </w:r>
+    </w:p>
+    <w:p/>
+    <w:p>
+      <w:pPr>
+        <w:rPr>
+          <w:b/>
+          <w:bCs/>
+        </w:rPr>
+      </w:pPr>
+      <w:r>
+        <w:rPr>
+          <w:b/>
+          <w:bCs/>
+        </w:rPr>
+        <w:t>17. Scalability Plan</w:t>
+      </w:r>
+    </w:p>
+    <w:p>
+      <w:pPr>
+        <w:rPr>
+          <w:b/>
+          <w:bCs/>
+        </w:rPr>
+      </w:pPr>
+      <w:r>
+        <w:rPr>
+          <w:b/>
+          <w:bCs/>
+        </w:rPr>
+        <w:t>Future Improvements</w:t>
+      </w:r>
+    </w:p>
+    <w:p>
+      <w:pPr>
+        <w:numPr>
+          <w:ilvl w:val="0"/>
+          <w:numId w:val="6"/>
+        </w:numPr>
+      </w:pPr>
+      <w:r>
+        <w:t xml:space="preserve">Kubernetes deployment </w:t>
+      </w:r>
+    </w:p>
+    <w:p>
+      <w:pPr>
+        <w:numPr>
+          <w:ilvl w:val="0"/>
+          <w:numId w:val="6"/>
+        </w:numPr>
+      </w:pPr>
+      <w:r>
+        <w:t xml:space="preserve">CDN optimization </w:t>
+      </w:r>
+    </w:p>
+    <w:p>
+      <w:pPr>
+        <w:numPr>
+          <w:ilvl w:val="0"/>
+          <w:numId w:val="6"/>
+        </w:numPr>
+      </w:pPr>
+      <w:r>
+        <w:t xml:space="preserve">Distributed </w:t>
+      </w:r>
+      <w:proofErr w:type="spellStart"/>
+      <w:r>
+        <w:t>websocket</w:t>
+      </w:r>
+      <w:proofErr w:type="spellEnd"/>
+      <w:r>
+        <w:t xml:space="preserve"> infrastructure </w:t>
+      </w:r>
+    </w:p>
+    <w:p>
+      <w:pPr>
+        <w:numPr>
+          <w:ilvl w:val="0"/>
+          <w:numId w:val="6"/>
+        </w:numPr>
+      </w:pPr>
+      <w:r>
+        <w:t>Caching layer expansion</w:t>
+      </w:r>
+    </w:p>
+    <w:p>
+      <w:pPr>
+        <w:rPr>
           <w:lang w:val="en-US"/>
         </w:rPr>
       </w:pPr>
@@ -1282,6 +1414,155 @@
     </w:lvl>
   </w:abstractNum>
   <w:abstractNum w:abstractNumId="2" w15:restartNumberingAfterBreak="0">
+    <w:nsid w:val="31F41501"/>
+    <w:multiLevelType w:val="multilevel"/>
+    <w:tmpl w:val="1D50E13C"/>
+    <w:lvl w:ilvl="0">
+      <w:start w:val="1"/>
+      <w:numFmt w:val="bullet"/>
+      <w:lvlText w:val=""/>
+      <w:lvlJc w:val="left"/>
+      <w:pPr>
+        <w:tabs>
+          <w:tab w:val="num" w:pos="720"/>
+        </w:tabs>
+        <w:ind w:left="720" w:hanging="360"/>
+      </w:pPr>
+      <w:rPr>
+        <w:rFonts w:ascii="Symbol" w:hAnsi="Symbol" w:hint="default"/>
+        <w:sz w:val="20"/>
+      </w:rPr>
+    </w:lvl>
+    <w:lvl w:ilvl="1" w:tentative="1">
+      <w:start w:val="1"/>
+      <w:numFmt w:val="bullet"/>
+      <w:lvlText w:val="o"/>
+      <w:lvlJc w:val="left"/>
+      <w:pPr>
+        <w:tabs>
+          <w:tab w:val="num" w:pos="1440"/>
+        </w:tabs>
+        <w:ind w:left="1440" w:hanging="360"/>
+      </w:pPr>
+      <w:rPr>
+        <w:rFonts w:ascii="Courier New" w:hAnsi="Courier New" w:hint="default"/>
+        <w:sz w:val="20"/>
+      </w:rPr>
+    </w:lvl>
+    <w:lvl w:ilvl="2" w:tentative="1">
+      <w:start w:val="1"/>
+      <w:numFmt w:val="bullet"/>
+      <w:lvlText w:val=""/>
+      <w:lvlJc w:val="left"/>
+      <w:pPr>
+        <w:tabs>
+          <w:tab w:val="num" w:pos="2160"/>
+        </w:tabs>
+        <w:ind w:left="2160" w:hanging="360"/>
+      </w:pPr>
+      <w:rPr>
+        <w:rFonts w:ascii="Wingdings" w:hAnsi="Wingdings" w:hint="default"/>
+        <w:sz w:val="20"/>
+      </w:rPr>
+    </w:lvl>
+    <w:lvl w:ilvl="3" w:tentative="1">
+      <w:start w:val="1"/>
+      <w:numFmt w:val="bullet"/>
+      <w:lvlText w:val=""/>
+      <w:lvlJc w:val="left"/>
+      <w:pPr>
+        <w:tabs>
+          <w:tab w:val="num" w:pos="2880"/>
+        </w:tabs>
+        <w:ind w:left="2880" w:hanging="360"/>
+      </w:pPr>
+      <w:rPr>
+        <w:rFonts w:ascii="Wingdings" w:hAnsi="Wingdings" w:hint="default"/>
+        <w:sz w:val="20"/>
+      </w:rPr>
+    </w:lvl>
+    <w:lvl w:ilvl="4" w:tentative="1">
+      <w:start w:val="1"/>
+      <w:numFmt w:val="bullet"/>
+      <w:lvlText w:val=""/>
+      <w:lvlJc w:val="left"/>
+      <w:pPr>
+        <w:tabs>
+          <w:tab w:val="num" w:pos="3600"/>
+        </w:tabs>
+        <w:ind w:left="3600" w:hanging="360"/>
+      </w:pPr>
+      <w:rPr>
+        <w:rFonts w:ascii="Wingdings" w:hAnsi="Wingdings" w:hint="default"/>
+        <w:sz w:val="20"/>
+      </w:rPr>
+    </w:lvl>
+    <w:lvl w:ilvl="5" w:tentative="1">
+      <w:start w:val="1"/>
+      <w:numFmt w:val="bullet"/>
+      <w:lvlText w:val=""/>
+      <w:lvlJc w:val="left"/>
+      <w:pPr>
+        <w:tabs>
+          <w:tab w:val="num" w:pos="4320"/>
+        </w:tabs>
+        <w:ind w:left="4320" w:hanging="360"/>
+      </w:pPr>
+      <w:rPr>
+        <w:rFonts w:ascii="Wingdings" w:hAnsi="Wingdings" w:hint="default"/>
+        <w:sz w:val="20"/>
+      </w:rPr>
+    </w:lvl>
+    <w:lvl w:ilvl="6" w:tentative="1">
+      <w:start w:val="1"/>
+      <w:numFmt w:val="bullet"/>
+      <w:lvlText w:val=""/>
+      <w:lvlJc w:val="left"/>
+      <w:pPr>
+        <w:tabs>
+          <w:tab w:val="num" w:pos="5040"/>
+        </w:tabs>
+        <w:ind w:left="5040" w:hanging="360"/>
+      </w:pPr>
+      <w:rPr>
+        <w:rFonts w:ascii="Wingdings" w:hAnsi="Wingdings" w:hint="default"/>
+        <w:sz w:val="20"/>
+      </w:rPr>
+    </w:lvl>
+    <w:lvl w:ilvl="7" w:tentative="1">
+      <w:start w:val="1"/>
+      <w:numFmt w:val="bullet"/>
+      <w:lvlText w:val=""/>
+      <w:lvlJc w:val="left"/>
+      <w:pPr>
+        <w:tabs>
+          <w:tab w:val="num" w:pos="5760"/>
+        </w:tabs>
+        <w:ind w:left="5760" w:hanging="360"/>
+      </w:pPr>
+      <w:rPr>
+        <w:rFonts w:ascii="Wingdings" w:hAnsi="Wingdings" w:hint="default"/>
+        <w:sz w:val="20"/>
+      </w:rPr>
+    </w:lvl>
+    <w:lvl w:ilvl="8" w:tentative="1">
+      <w:start w:val="1"/>
+      <w:numFmt w:val="bullet"/>
+      <w:lvlText w:val=""/>
+      <w:lvlJc w:val="left"/>
+      <w:pPr>
+        <w:tabs>
+          <w:tab w:val="num" w:pos="6480"/>
+        </w:tabs>
+        <w:ind w:left="6480" w:hanging="360"/>
+      </w:pPr>
+      <w:rPr>
+        <w:rFonts w:ascii="Wingdings" w:hAnsi="Wingdings" w:hint="default"/>
+        <w:sz w:val="20"/>
+      </w:rPr>
+    </w:lvl>
+  </w:abstractNum>
+  <w:abstractNum w:abstractNumId="3" w15:restartNumberingAfterBreak="0">
     <w:nsid w:val="322F618C"/>
     <w:multiLevelType w:val="multilevel"/>
     <w:tmpl w:val="E5AEE2CE"/>
@@ -1430,7 +1711,7 @@
       </w:rPr>
     </w:lvl>
   </w:abstractNum>
-  <w:abstractNum w:abstractNumId="3" w15:restartNumberingAfterBreak="0">
+  <w:abstractNum w:abstractNumId="4" w15:restartNumberingAfterBreak="0">
     <w:nsid w:val="360C19CC"/>
     <w:multiLevelType w:val="multilevel"/>
     <w:tmpl w:val="B68E0FC6"/>
@@ -1579,7 +1860,7 @@
       </w:rPr>
     </w:lvl>
   </w:abstractNum>
-  <w:abstractNum w:abstractNumId="4" w15:restartNumberingAfterBreak="0">
+  <w:abstractNum w:abstractNumId="5" w15:restartNumberingAfterBreak="0">
     <w:nsid w:val="657326C9"/>
     <w:multiLevelType w:val="multilevel"/>
     <w:tmpl w:val="63F667A0"/>
@@ -1729,10 +2010,10 @@
     </w:lvl>
   </w:abstractNum>
   <w:num w:numId="1" w16cid:durableId="1019967548">
-    <w:abstractNumId w:val="3"/>
+    <w:abstractNumId w:val="4"/>
   </w:num>
   <w:num w:numId="2" w16cid:durableId="1906060832">
-    <w:abstractNumId w:val="4"/>
+    <w:abstractNumId w:val="5"/>
   </w:num>
   <w:num w:numId="3" w16cid:durableId="1876187339">
     <w:abstractNumId w:val="0"/>
@@ -1741,6 +2022,9 @@
     <w:abstractNumId w:val="1"/>
   </w:num>
   <w:num w:numId="5" w16cid:durableId="1183012877">
+    <w:abstractNumId w:val="3"/>
+  </w:num>
+  <w:num w:numId="6" w16cid:durableId="617218967">
     <w:abstractNumId w:val="2"/>
   </w:num>
 </w:numbering>

</xml_diff>